<commit_message>
Add multi-agent Cloud Run router auth
</commit_message>
<xml_diff>
--- a/docs/ROUTING_AGENT_DETAILED_STEPS.docx
+++ b/docs/ROUTING_AGENT_DETAILED_STEPS.docx
@@ -579,7 +579,7 @@
         <w:shd w:fill="F2F4F7"/>
       </w:pPr>
       <w:r>
-        <w:t>GOOGLE_CLOUD_PROJECT: "us-con-gcp-sbx-dep0049-081624"</w:t>
+        <w:t>GOOGLE_CLOUD_PROJECT: "YOUR_PROJECT_ID"</w:t>
         <w:br/>
         <w:t>GOOGLE_CLOUD_LOCATION: "global"</w:t>
         <w:br/>
@@ -685,7 +685,7 @@
         <w:br/>
         <w:t xml:space="preserve">  --region us-central1 `</w:t>
         <w:br/>
-        <w:t xml:space="preserve">  --project us-con-gcp-sbx-dep0049-081624 `</w:t>
+        <w:t xml:space="preserve">  --project YOUR_PROJECT_ID `</w:t>
         <w:br/>
         <w:t xml:space="preserve">  --allow-unauthenticated `</w:t>
         <w:br/>
@@ -707,7 +707,7 @@
         <w:br/>
         <w:t xml:space="preserve">  --region us-central1 `</w:t>
         <w:br/>
-        <w:t xml:space="preserve">  --project us-con-gcp-sbx-dep0049-081624 `</w:t>
+        <w:t xml:space="preserve">  --project YOUR_PROJECT_ID `</w:t>
         <w:br/>
         <w:t xml:space="preserve">  --format="value(status.url)"</w:t>
       </w:r>

</xml_diff>